<commit_message>
Auto Backup: 2026/03/27 19:50:55.14
</commit_message>
<xml_diff>
--- a/RCJ2026/Kanto Block Project/others/2026ブロック大会 予算書.docx
+++ b/RCJ2026/Kanto Block Project/others/2026ブロック大会 予算書.docx
@@ -1151,7 +1151,7 @@
           <w:lang w:val="ja-JP"/>
         </w:rPr>
         <w:drawing>
-          <wp:inline distT="0" distB="0" distL="0" distR="0" wp14:anchorId="252BF459" wp14:editId="73D7A0DC">
+          <wp:inline distT="0" distB="0" distL="0" distR="0" wp14:anchorId="252BF459" wp14:editId="26D93E91">
             <wp:extent cx="1620000" cy="1928964"/>
             <wp:effectExtent l="0" t="0" r="0" b="0"/>
             <wp:docPr id="1932003714" name="図 11"/>
@@ -1415,7 +1415,7 @@
           <w:lang w:val="ja-JP"/>
         </w:rPr>
         <w:drawing>
-          <wp:inline distT="0" distB="0" distL="0" distR="0" wp14:anchorId="627D4C79" wp14:editId="72E5C586">
+          <wp:inline distT="0" distB="0" distL="0" distR="0" wp14:anchorId="627D4C79" wp14:editId="53C42556">
             <wp:extent cx="2948393" cy="1620000"/>
             <wp:effectExtent l="0" t="0" r="4445" b="0"/>
             <wp:docPr id="259531365" name="図 14"/>
@@ -1796,7 +1796,7 @@
           <w:lang w:val="ja-JP"/>
         </w:rPr>
         <w:drawing>
-          <wp:anchor distT="0" distB="0" distL="114300" distR="114300" simplePos="0" relativeHeight="251658240" behindDoc="0" locked="0" layoutInCell="1" allowOverlap="1" wp14:anchorId="72F6080A" wp14:editId="50A206A5">
+          <wp:anchor distT="0" distB="0" distL="114300" distR="114300" simplePos="0" relativeHeight="251658240" behindDoc="0" locked="0" layoutInCell="1" allowOverlap="1" wp14:anchorId="72F6080A" wp14:editId="75C9A4CC">
             <wp:simplePos x="0" y="0"/>
             <wp:positionH relativeFrom="column">
               <wp:posOffset>3598636</wp:posOffset>
@@ -1858,7 +1858,7 @@
           <w:lang w:val="ja-JP"/>
         </w:rPr>
         <w:drawing>
-          <wp:inline distT="0" distB="0" distL="0" distR="0" wp14:anchorId="0193B05E" wp14:editId="6E626AA4">
+          <wp:inline distT="0" distB="0" distL="0" distR="0" wp14:anchorId="0193B05E" wp14:editId="25D4F50C">
             <wp:extent cx="3600000" cy="916248"/>
             <wp:effectExtent l="0" t="0" r="635" b="0"/>
             <wp:docPr id="751389721" name="図 20"/>
@@ -1906,7 +1906,7 @@
           <w:lang w:val="ja-JP"/>
         </w:rPr>
         <w:drawing>
-          <wp:inline distT="0" distB="0" distL="0" distR="0" wp14:anchorId="749A1B18" wp14:editId="67B6E454">
+          <wp:inline distT="0" distB="0" distL="0" distR="0" wp14:anchorId="749A1B18" wp14:editId="3D31429A">
             <wp:extent cx="3600000" cy="893920"/>
             <wp:effectExtent l="0" t="0" r="635" b="1905"/>
             <wp:docPr id="709883418" name="図 21"/>
@@ -2179,7 +2179,7 @@
           <w:lang w:val="ja-JP"/>
         </w:rPr>
         <w:drawing>
-          <wp:inline distT="0" distB="0" distL="0" distR="0" wp14:anchorId="7D5FB035" wp14:editId="123A7568">
+          <wp:inline distT="0" distB="0" distL="0" distR="0" wp14:anchorId="7D5FB035" wp14:editId="67BC485F">
             <wp:extent cx="3076320" cy="1800000"/>
             <wp:effectExtent l="0" t="0" r="0" b="0"/>
             <wp:docPr id="1602421093" name="図 9"/>
@@ -2331,7 +2331,7 @@
           <w:lang w:val="ja-JP"/>
         </w:rPr>
         <w:drawing>
-          <wp:inline distT="0" distB="0" distL="0" distR="0" wp14:anchorId="65DA2FB3" wp14:editId="7A365A7D">
+          <wp:inline distT="0" distB="0" distL="0" distR="0" wp14:anchorId="65DA2FB3" wp14:editId="183FEEE3">
             <wp:extent cx="3806136" cy="1800000"/>
             <wp:effectExtent l="0" t="0" r="4445" b="0"/>
             <wp:docPr id="583809535" name="図 8"/>
@@ -2429,7 +2429,7 @@
         <w:spacing w:line="240" w:lineRule="auto"/>
         <w:jc w:val="both"/>
         <w:rPr>
-          <w:rFonts w:ascii="メイリオ" w:eastAsia="メイリオ" w:hAnsi="メイリオ" w:cs="メイリオ" w:hint="eastAsia"/>
+          <w:rFonts w:ascii="メイリオ" w:eastAsia="メイリオ" w:hAnsi="メイリオ" w:cs="メイリオ"/>
           <w:b/>
           <w:bCs/>
           <w:sz w:val="36"/>
@@ -2461,6 +2461,7 @@
       <w:r>
         <w:rPr>
           <w:rFonts w:ascii="メイリオ" w:eastAsia="メイリオ" w:hAnsi="メイリオ" w:cs="メイリオ"/>
+          <w:noProof/>
           <w:sz w:val="28"/>
           <w:szCs w:val="28"/>
         </w:rPr>
@@ -2507,7 +2508,7 @@
         <w:spacing w:line="240" w:lineRule="auto"/>
         <w:jc w:val="both"/>
         <w:rPr>
-          <w:rFonts w:ascii="メイリオ" w:eastAsia="メイリオ" w:hAnsi="メイリオ" w:cs="メイリオ" w:hint="eastAsia"/>
+          <w:rFonts w:ascii="メイリオ" w:eastAsia="メイリオ" w:hAnsi="メイリオ" w:cs="メイリオ"/>
         </w:rPr>
       </w:pPr>
       <w:r>
@@ -2587,7 +2588,7 @@
         <w:spacing w:line="240" w:lineRule="auto"/>
         <w:jc w:val="both"/>
         <w:rPr>
-          <w:rFonts w:ascii="メイリオ" w:eastAsia="メイリオ" w:hAnsi="メイリオ" w:cs="メイリオ" w:hint="eastAsia"/>
+          <w:rFonts w:ascii="メイリオ" w:eastAsia="メイリオ" w:hAnsi="メイリオ" w:cs="メイリオ"/>
         </w:rPr>
       </w:pPr>
       <w:r>
@@ -2747,9 +2748,7 @@
         <w:spacing w:line="240" w:lineRule="auto"/>
         <w:jc w:val="both"/>
         <w:rPr>
-          <w:rFonts w:ascii="メイリオ" w:eastAsia="メイリオ" w:hAnsi="メイリオ" w:cs="メイリオ"/>
-          <w:b/>
-          <w:bCs/>
+          <w:rFonts w:ascii="メイリオ" w:eastAsia="メイリオ" w:hAnsi="メイリオ" w:cs="メイリオ" w:hint="eastAsia"/>
         </w:rPr>
       </w:pPr>
       <w:r>

</xml_diff>